<commit_message>
Fase 6.4: necesidad y proporcionalidad en el borrador de EIPD (EIPD-07)
- Apartado «3 bis. Evaluación de la necesidad y la proporcionalidad»
  (Art. 35.7.b RGPD, cotejado en EUR-Lex): idoneidad, alternativas menos
  intrusivas, motivos para usar el sistema, minimización y proporcionalidad
  en sentido estricto, con lo declarado en cada juicio. La conclusión queda
  «A COMPLETAR» por el responsable con el asesoramiento del DPD.
- Matriz de cobertura AEPD (objetivo B.3), registro de fuentes y matriz de
  hallazgos actualizados.
- Caso notas-de-prensa: en la Diputación se ejecuta con modelos locales; el
  motor avisa de que la documentación publicada cita la API de Gemini.
- Ejemplos regenerados; 206 pruebas en verde.
</commit_message>
<xml_diff>
--- a/Resultados prueba app analizador ayudas/EIPD_Borrador_Analizador_Ayudas.docx
+++ b/Resultados prueba app analizador ayudas/EIPD_Borrador_Analizador_Ayudas.docx
@@ -1240,6 +1240,358 @@
       <w:r>
         <w:t xml:space="preserve">Declarado: registro de actividad con conservación de 24 meses. No se ha comprobado su existencia ni su protección.</w:t>
       </w:r>
+    </w:p>
+    <w:p>
+      <w:pPr>
+        <w:pStyle w:val="Heading1"/>
+        <w:spacing w:after="200" w:before="400"/>
+      </w:pPr>
+      <w:r>
+        <w:t xml:space="preserve">3 bis. EVALUACIÓN DE LA NECESIDAD Y LA PROPORCIONALIDAD (ART. 35.7.b RGPD)</w:t>
+      </w:r>
+    </w:p>
+    <w:p>
+      <w:pPr>
+        <w:spacing w:after="150"/>
+      </w:pPr>
+      <w:r>
+        <w:t xml:space="preserve">La EIPD debe incluir una evaluación de la necesidad y la proporcionalidad de las operaciones de tratamiento con respecto a su finalidad (Art. 35.7.b RGPD). La herramienta recoge lo declarado y plantea las preguntas; no las responde. Las preguntas siguen el objetivo «Análisis de la proporcionalidad y necesidad» de los Requisitos para auditorías de tratamientos que incluyan IA de la AEPD.</w:t>
+      </w:r>
+    </w:p>
+    <w:tbl>
+      <w:tblPr>
+        <w:tblW w:type="pct" w:w="5000"/>
+        <w:tblBorders>
+          <w:top w:val="single" w:color="auto" w:sz="4"/>
+          <w:left w:val="single" w:color="auto" w:sz="4"/>
+          <w:bottom w:val="single" w:color="auto" w:sz="4"/>
+          <w:right w:val="single" w:color="auto" w:sz="4"/>
+          <w:insideH w:val="single" w:color="auto" w:sz="4"/>
+          <w:insideV w:val="single" w:color="auto" w:sz="4"/>
+        </w:tblBorders>
+      </w:tblPr>
+      <w:tblGrid>
+        <w:gridCol w:w="1633"/>
+        <w:gridCol w:w="2903"/>
+        <w:gridCol w:w="2722"/>
+        <w:gridCol w:w="1814"/>
+      </w:tblGrid>
+      <w:tr>
+        <w:tc>
+          <w:tcPr>
+            <w:tcW w:type="pct" w:w="900"/>
+            <w:shd w:fill="065F46" w:val="clear"/>
+          </w:tcPr>
+          <w:p>
+            <w:r>
+              <w:rPr>
+                <w:b/>
+                <w:bCs/>
+                <w:color w:val="FFFFFF"/>
+              </w:rPr>
+              <w:t xml:space="preserve">Juicio</w:t>
+            </w:r>
+          </w:p>
+        </w:tc>
+        <w:tc>
+          <w:tcPr>
+            <w:tcW w:type="pct" w:w="1600"/>
+            <w:shd w:fill="065F46" w:val="clear"/>
+          </w:tcPr>
+          <w:p>
+            <w:r>
+              <w:rPr>
+                <w:b/>
+                <w:bCs/>
+                <w:color w:val="FFFFFF"/>
+              </w:rPr>
+              <w:t xml:space="preserve">Pregunta</w:t>
+            </w:r>
+          </w:p>
+        </w:tc>
+        <w:tc>
+          <w:tcPr>
+            <w:tcW w:type="pct" w:w="1500"/>
+            <w:shd w:fill="065F46" w:val="clear"/>
+          </w:tcPr>
+          <w:p>
+            <w:r>
+              <w:rPr>
+                <w:b/>
+                <w:bCs/>
+                <w:color w:val="FFFFFF"/>
+              </w:rPr>
+              <w:t xml:space="preserve">Lo que consta</w:t>
+            </w:r>
+          </w:p>
+        </w:tc>
+        <w:tc>
+          <w:tcPr>
+            <w:tcW w:type="pct" w:w="1000"/>
+            <w:shd w:fill="065F46" w:val="clear"/>
+          </w:tcPr>
+          <w:p>
+            <w:r>
+              <w:rPr>
+                <w:b/>
+                <w:bCs/>
+                <w:color w:val="FFFFFF"/>
+              </w:rPr>
+              <w:t xml:space="preserve">Conclusión</w:t>
+            </w:r>
+          </w:p>
+        </w:tc>
+      </w:tr>
+      <w:tr>
+        <w:tc>
+          <w:p>
+            <w:r>
+              <w:rPr>
+                <w:b/>
+                <w:bCs/>
+                <w:sz w:val="20"/>
+                <w:szCs w:val="20"/>
+              </w:rPr>
+              <w:t xml:space="preserve">Idoneidad</w:t>
+            </w:r>
+          </w:p>
+        </w:tc>
+        <w:tc>
+          <w:p>
+            <w:r>
+              <w:rPr>
+                <w:sz w:val="20"/>
+                <w:szCs w:val="20"/>
+              </w:rPr>
+              <w:t xml:space="preserve">¿Sirve el tratamiento para alcanzar la finalidad declarada?</w:t>
+            </w:r>
+          </w:p>
+        </w:tc>
+        <w:tc>
+          <w:p>
+            <w:r>
+              <w:rPr>
+                <w:sz w:val="20"/>
+                <w:szCs w:val="20"/>
+              </w:rPr>
+              <w:t xml:space="preserve">Finalidad declarada: «Asistente que extrae plazos, requisitos y criterios de convocatorias de ayudas y propone ideas de proyecto para la entidad local.».</w:t>
+            </w:r>
+          </w:p>
+        </w:tc>
+        <w:tc>
+          <w:p>
+            <w:r>
+              <w:rPr>
+                <w:color w:val="64748B"/>
+                <w:sz w:val="20"/>
+                <w:szCs w:val="20"/>
+              </w:rPr>
+              <w:t xml:space="preserve">A COMPLETAR por el responsable del tratamiento, con el asesoramiento del DPD.</w:t>
+            </w:r>
+          </w:p>
+        </w:tc>
+      </w:tr>
+      <w:tr>
+        <w:tc>
+          <w:p>
+            <w:r>
+              <w:rPr>
+                <w:b/>
+                <w:bCs/>
+                <w:sz w:val="20"/>
+                <w:szCs w:val="20"/>
+              </w:rPr>
+              <w:t xml:space="preserve">Alternativas menos intrusivas</w:t>
+            </w:r>
+          </w:p>
+        </w:tc>
+        <w:tc>
+          <w:p>
+            <w:r>
+              <w:rPr>
+                <w:sz w:val="20"/>
+                <w:szCs w:val="20"/>
+              </w:rPr>
+              <w:t xml:space="preserve">¿Se ha comparado con opciones que traten menos datos o supongan menos riesgo: sin IA, sin datos personales o con datos seudonimizados, con un modelo en servidores propios?</w:t>
+            </w:r>
+          </w:p>
+        </w:tc>
+        <w:tc>
+          <w:p>
+            <w:r>
+              <w:rPr>
+                <w:sz w:val="20"/>
+                <w:szCs w:val="20"/>
+              </w:rPr>
+              <w:t xml:space="preserve">Declarado que el sistema usa IA (infiere sus resultados). Se declara ejecución en servidores propios de la entidad.</w:t>
+            </w:r>
+          </w:p>
+        </w:tc>
+        <w:tc>
+          <w:p>
+            <w:r>
+              <w:rPr>
+                <w:color w:val="64748B"/>
+                <w:sz w:val="20"/>
+                <w:szCs w:val="20"/>
+              </w:rPr>
+              <w:t xml:space="preserve">A COMPLETAR por el responsable del tratamiento, con el asesoramiento del DPD.</w:t>
+            </w:r>
+          </w:p>
+        </w:tc>
+      </w:tr>
+      <w:tr>
+        <w:tc>
+          <w:p>
+            <w:r>
+              <w:rPr>
+                <w:b/>
+                <w:bCs/>
+                <w:sz w:val="20"/>
+                <w:szCs w:val="20"/>
+              </w:rPr>
+              <w:t xml:space="preserve">Motivos para usar este sistema</w:t>
+            </w:r>
+          </w:p>
+        </w:tc>
+        <w:tc>
+          <w:p>
+            <w:r>
+              <w:rPr>
+                <w:sz w:val="20"/>
+                <w:szCs w:val="20"/>
+              </w:rPr>
+              <w:t xml:space="preserve">¿Por qué se usa este sistema y no el procedimiento anterior? Si se aborda un problema nuevo, ¿por qué con IA?</w:t>
+            </w:r>
+          </w:p>
+        </w:tc>
+        <w:tc>
+          <w:p>
+            <w:r>
+              <w:rPr>
+                <w:sz w:val="20"/>
+                <w:szCs w:val="20"/>
+              </w:rPr>
+              <w:t xml:space="preserve">No consta en la entrevista.</w:t>
+            </w:r>
+          </w:p>
+        </w:tc>
+        <w:tc>
+          <w:p>
+            <w:r>
+              <w:rPr>
+                <w:color w:val="64748B"/>
+                <w:sz w:val="20"/>
+                <w:szCs w:val="20"/>
+              </w:rPr>
+              <w:t xml:space="preserve">A COMPLETAR por el responsable del tratamiento, con el asesoramiento del DPD.</w:t>
+            </w:r>
+          </w:p>
+        </w:tc>
+      </w:tr>
+      <w:tr>
+        <w:tc>
+          <w:p>
+            <w:r>
+              <w:rPr>
+                <w:b/>
+                <w:bCs/>
+                <w:sz w:val="20"/>
+                <w:szCs w:val="20"/>
+              </w:rPr>
+              <w:t xml:space="preserve">Minimización</w:t>
+            </w:r>
+          </w:p>
+        </w:tc>
+        <w:tc>
+          <w:p>
+            <w:r>
+              <w:rPr>
+                <w:sz w:val="20"/>
+                <w:szCs w:val="20"/>
+              </w:rPr>
+              <w:t xml:space="preserve">¿Se tratan solo los datos imprescindibles para la finalidad?</w:t>
+            </w:r>
+          </w:p>
+        </w:tc>
+        <w:tc>
+          <w:p>
+            <w:r>
+              <w:rPr>
+                <w:sz w:val="20"/>
+                <w:szCs w:val="20"/>
+              </w:rPr>
+              <w:t xml:space="preserve">Declarado que no se tratan datos personales.</w:t>
+            </w:r>
+          </w:p>
+        </w:tc>
+        <w:tc>
+          <w:p>
+            <w:r>
+              <w:rPr>
+                <w:color w:val="64748B"/>
+                <w:sz w:val="20"/>
+                <w:szCs w:val="20"/>
+              </w:rPr>
+              <w:t xml:space="preserve">A COMPLETAR por el responsable del tratamiento, con el asesoramiento del DPD.</w:t>
+            </w:r>
+          </w:p>
+        </w:tc>
+      </w:tr>
+      <w:tr>
+        <w:tc>
+          <w:p>
+            <w:r>
+              <w:rPr>
+                <w:b/>
+                <w:bCs/>
+                <w:sz w:val="20"/>
+                <w:szCs w:val="20"/>
+              </w:rPr>
+              <w:t xml:space="preserve">Proporcionalidad en sentido estricto</w:t>
+            </w:r>
+          </w:p>
+        </w:tc>
+        <w:tc>
+          <w:p>
+            <w:r>
+              <w:rPr>
+                <w:sz w:val="20"/>
+                <w:szCs w:val="20"/>
+              </w:rPr>
+              <w:t xml:space="preserve">¿Compensan los beneficios para el interés público los riesgos para los derechos de los interesados?</w:t>
+            </w:r>
+          </w:p>
+        </w:tc>
+        <w:tc>
+          <w:p>
+            <w:r>
+              <w:rPr>
+                <w:sz w:val="20"/>
+                <w:szCs w:val="20"/>
+              </w:rPr>
+              <w:t xml:space="preserve">Cribado: según lo declarado no concurren dos o más criterios de riesgo. Véase el apartado 4 bis.</w:t>
+            </w:r>
+          </w:p>
+        </w:tc>
+        <w:tc>
+          <w:p>
+            <w:r>
+              <w:rPr>
+                <w:color w:val="64748B"/>
+                <w:sz w:val="20"/>
+                <w:szCs w:val="20"/>
+              </w:rPr>
+              <w:t xml:space="preserve">A COMPLETAR por el responsable del tratamiento, con el asesoramiento del DPD.</w:t>
+            </w:r>
+          </w:p>
+        </w:tc>
+      </w:tr>
+    </w:tbl>
+    <w:p>
+      <w:pPr>
+        <w:spacing w:after="200"/>
+      </w:pPr>
     </w:p>
     <w:p>
       <w:pPr>

</xml_diff>

<commit_message>
Fase 6.7: respuestas confirmadas de los casos reales, guía y capturas (UX-04)
- El autor confirma las respuestas de las cuatro aplicaciones de la
  Diputación; lo que desconoce queda en «no lo sé». Monitor BOE: EIPD
  necesaria (solvencia y cruce con la base de datos provincial); notas de
  prensa: EIPD por determinar.
- Guía de usuario: la barra de pestañas ya no se encoge ni tapa los títulos.
- Informe técnico: textos sin «documento formal exhaustivo» ni «diligencias»;
  la pregunta de configuración del modelo solo aparece si el sistema usa IA.
- Capturas de la portada y del informe en el README.
</commit_message>
<xml_diff>
--- a/Resultados prueba app analizador ayudas/EIPD_Borrador_Analizador_Ayudas.docx
+++ b/Resultados prueba app analizador ayudas/EIPD_Borrador_Analizador_Ayudas.docx
@@ -1208,7 +1208,7 @@
         <w:t xml:space="preserve">• Recogida e Ingesta: </w:t>
       </w:r>
       <w:r>
-        <w:t xml:space="preserve">Declarado: las entradas proceden de la tramitación de expedientes en el procedimiento administrativo (Ley 39/2015).</w:t>
+        <w:t xml:space="preserve">No consta la norma que regula el procedimiento del que proceden los datos.</w:t>
       </w:r>
     </w:p>
     <w:p>
@@ -1238,7 +1238,7 @@
         <w:t xml:space="preserve">• Conservación y Trazabilidad: </w:t>
       </w:r>
       <w:r>
-        <w:t xml:space="preserve">Declarado: registro de actividad con conservación de 24 meses. No se ha comprobado su existencia ni su protección.</w:t>
+        <w:t xml:space="preserve">Declarado que no existe registro de actividad.</w:t>
       </w:r>
     </w:p>
     <w:p>
@@ -1783,7 +1783,7 @@
                 <w:sz w:val="20"/>
                 <w:szCs w:val="20"/>
               </w:rPr>
-              <w:t xml:space="preserve">revisión humana previa (declarada); registro de actividad (declarado); ejecución local (declarada)</w:t>
+              <w:t xml:space="preserve">revisión humana previa (declarada); ejecución local (declarada)</w:t>
             </w:r>
           </w:p>
         </w:tc>

</xml_diff>